<commit_message>
Sin and Codex: Update 2026 resume summary documents
Commit the current revisions to the Word resume summary and its companion PDF in the Resume folder.

This change includes both modified document files and does not change application code or site assets.
</commit_message>
<xml_diff>
--- a/Resume/Louiery Sincioco - Summary (2026).docx
+++ b/Resume/Louiery Sincioco - Summary (2026).docx
@@ -12,13 +12,13 @@
           <w:noProof/>
         </w:rPr>
         <w:drawing>
-          <wp:anchor distT="0" distB="0" distL="114300" distR="114300" simplePos="0" relativeHeight="251659776" behindDoc="1" locked="0" layoutInCell="1" allowOverlap="1" wp14:anchorId="6C54D39A" wp14:editId="5840F7DF">
+          <wp:anchor distT="0" distB="0" distL="114300" distR="114300" simplePos="0" relativeHeight="251659776" behindDoc="1" locked="0" layoutInCell="1" allowOverlap="1" wp14:anchorId="6C54D39A" wp14:editId="249EAB4F">
             <wp:simplePos x="0" y="0"/>
             <wp:positionH relativeFrom="column">
-              <wp:posOffset>4645069</wp:posOffset>
+              <wp:posOffset>4610519</wp:posOffset>
             </wp:positionH>
             <wp:positionV relativeFrom="paragraph">
-              <wp:posOffset>-476250</wp:posOffset>
+              <wp:posOffset>-433118</wp:posOffset>
             </wp:positionV>
             <wp:extent cx="2067560" cy="2343150"/>
             <wp:effectExtent l="0" t="0" r="0" b="0"/>
@@ -97,6 +97,19 @@
         </w:rPr>
         <w:t>Software Architect and Technical Lead</w:t>
       </w:r>
+      <w:r>
+        <w:rPr>
+          <w:sz w:val="32"/>
+        </w:rPr>
+        <w:t>,</w:t>
+      </w:r>
+      <w:r>
+        <w:rPr>
+          <w:sz w:val="32"/>
+        </w:rPr>
+        <w:br/>
+        <w:t>Agentic AI / AI Engineer</w:t>
+      </w:r>
     </w:p>
     <w:p>
       <w:pPr>
@@ -135,11 +148,6 @@
         </w:rPr>
         <w:t>+63 (966) 230-4023</w:t>
       </w:r>
-    </w:p>
-    <w:p>
-      <w:pPr>
-        <w:spacing w:after="60"/>
-      </w:pPr>
     </w:p>
     <w:p>
       <w:pPr>

</xml_diff>